<commit_message>
Expand keyword coloring with domain-specific terms across all summaries
Added _keywords.py with 123 RED and 129 ORANGE keywords covering
attack/security domain terms (exploit, inject, breach, protect, encrypt, etc.)
so that important words in definitions are highlighted in all 3 summaries.

Fixed import placement in create_ds_summary.py and create_websec_summary.py
(was inside docstring). Regenerated all 6 output files.

https://claude.ai/code/session_01MHQ5ctkew7wfHNg848V1gb
</commit_message>
<xml_diff>
--- a/apache_summary.docx
+++ b/apache_summary.docx
@@ -200,6 +200,8 @@
       </w:r>
       <w:r>
         <w:rPr>
+          <w:b/>
+          <w:color w:val="C05500"/>
           <w:sz w:val="20"/>
         </w:rPr>
         <w:t xml:space="preserve">patches </w:t>
@@ -378,6 +380,8 @@
       </w:r>
       <w:r>
         <w:rPr>
+          <w:b/>
+          <w:color w:val="C05500"/>
           <w:sz w:val="20"/>
         </w:rPr>
         <w:t xml:space="preserve">security </w:t>
@@ -396,6 +400,8 @@
       </w:r>
       <w:r>
         <w:rPr>
+          <w:b/>
+          <w:color w:val="C05500"/>
           <w:sz w:val="20"/>
         </w:rPr>
         <w:t xml:space="preserve">encrypts </w:t>
@@ -462,6 +468,8 @@
       </w:r>
       <w:r>
         <w:rPr>
+          <w:b/>
+          <w:color w:val="C05500"/>
           <w:sz w:val="20"/>
         </w:rPr>
         <w:t xml:space="preserve">keys, </w:t>
@@ -474,6 +482,8 @@
       </w:r>
       <w:r>
         <w:rPr>
+          <w:b/>
+          <w:color w:val="C05500"/>
           <w:sz w:val="20"/>
         </w:rPr>
         <w:t xml:space="preserve">keys, </w:t>
@@ -486,6 +496,8 @@
       </w:r>
       <w:r>
         <w:rPr>
+          <w:b/>
+          <w:color w:val="C05500"/>
           <w:sz w:val="20"/>
         </w:rPr>
         <w:t xml:space="preserve">certificates. </w:t>
@@ -676,6 +688,8 @@
       </w:r>
       <w:r>
         <w:rPr>
+          <w:b/>
+          <w:color w:val="C05500"/>
           <w:sz w:val="20"/>
         </w:rPr>
         <w:t xml:space="preserve">any </w:t>
@@ -1109,6 +1123,8 @@
       </w:r>
       <w:r>
         <w:rPr>
+          <w:b/>
+          <w:color w:val="C05500"/>
           <w:sz w:val="20"/>
         </w:rPr>
         <w:t xml:space="preserve">all </w:t>
@@ -1586,6 +1602,8 @@
       </w:r>
       <w:r>
         <w:rPr>
+          <w:b/>
+          <w:color w:val="C05500"/>
           <w:sz w:val="20"/>
         </w:rPr>
         <w:t xml:space="preserve">every </w:t>
@@ -2807,6 +2825,8 @@
       </w:r>
       <w:r>
         <w:rPr>
+          <w:b/>
+          <w:color w:val="C05500"/>
           <w:sz w:val="20"/>
         </w:rPr>
         <w:t xml:space="preserve">every </w:t>
@@ -3165,6 +3185,8 @@
       </w:r>
       <w:r>
         <w:rPr>
+          <w:b/>
+          <w:color w:val="C05500"/>
           <w:sz w:val="20"/>
         </w:rPr>
         <w:t xml:space="preserve">restrict </w:t>
@@ -4230,6 +4252,8 @@
       </w:r>
       <w:r>
         <w:rPr>
+          <w:b/>
+          <w:color w:val="C05500"/>
           <w:sz w:val="20"/>
         </w:rPr>
         <w:t xml:space="preserve">block. </w:t>
@@ -4808,12 +4832,16 @@
       </w:r>
       <w:r>
         <w:rPr>
+          <w:b/>
+          <w:color w:val="C05500"/>
           <w:sz w:val="20"/>
         </w:rPr>
         <w:t xml:space="preserve">encryption, </w:t>
       </w:r>
       <w:r>
         <w:rPr>
+          <w:b/>
+          <w:color w:val="C05500"/>
           <w:sz w:val="20"/>
         </w:rPr>
         <w:t xml:space="preserve">authentication, </w:t>
@@ -4832,6 +4860,8 @@
       </w:r>
       <w:r>
         <w:rPr>
+          <w:b/>
+          <w:color w:val="C05500"/>
           <w:sz w:val="20"/>
         </w:rPr>
         <w:t xml:space="preserve">integrity. </w:t>
@@ -4900,62 +4930,70 @@
       </w:r>
       <w:r>
         <w:rPr>
-          <w:sz w:val="20"/>
-        </w:rPr>
-        <w:t xml:space="preserve">key </w:t>
-      </w:r>
-      <w:r>
-        <w:rPr>
-          <w:sz w:val="20"/>
-        </w:rPr>
-        <w:t xml:space="preserve">to </w:t>
-      </w:r>
-      <w:r>
-        <w:rPr>
-          <w:sz w:val="20"/>
-        </w:rPr>
-        <w:t xml:space="preserve">encrypt </w:t>
-      </w:r>
-      <w:r>
-        <w:rPr>
-          <w:sz w:val="20"/>
-        </w:rPr>
-        <w:t xml:space="preserve">and </w:t>
-      </w:r>
-      <w:r>
-        <w:rPr>
-          <w:sz w:val="20"/>
-        </w:rPr>
-        <w:t xml:space="preserve">decrypt; </w:t>
-      </w:r>
-      <w:r>
-        <w:rPr>
-          <w:sz w:val="20"/>
-        </w:rPr>
-        <w:t xml:space="preserve">fast </w:t>
-      </w:r>
-      <w:r>
-        <w:rPr>
-          <w:sz w:val="20"/>
-        </w:rPr>
-        <w:t xml:space="preserve">but </w:t>
-      </w:r>
-      <w:r>
-        <w:rPr>
-          <w:sz w:val="20"/>
-        </w:rPr>
-        <w:t xml:space="preserve">requires </w:t>
-      </w:r>
-      <w:r>
-        <w:rPr>
           <w:b/>
           <w:color w:val="C05500"/>
           <w:sz w:val="20"/>
         </w:rPr>
+        <w:t xml:space="preserve">key </w:t>
+      </w:r>
+      <w:r>
+        <w:rPr>
+          <w:sz w:val="20"/>
+        </w:rPr>
+        <w:t xml:space="preserve">to </w:t>
+      </w:r>
+      <w:r>
+        <w:rPr>
+          <w:b/>
+          <w:color w:val="C05500"/>
+          <w:sz w:val="20"/>
+        </w:rPr>
+        <w:t xml:space="preserve">encrypt </w:t>
+      </w:r>
+      <w:r>
+        <w:rPr>
+          <w:sz w:val="20"/>
+        </w:rPr>
+        <w:t xml:space="preserve">and </w:t>
+      </w:r>
+      <w:r>
+        <w:rPr>
+          <w:b/>
+          <w:color w:val="C05500"/>
+          <w:sz w:val="20"/>
+        </w:rPr>
+        <w:t xml:space="preserve">decrypt; </w:t>
+      </w:r>
+      <w:r>
+        <w:rPr>
+          <w:sz w:val="20"/>
+        </w:rPr>
+        <w:t xml:space="preserve">fast </w:t>
+      </w:r>
+      <w:r>
+        <w:rPr>
+          <w:sz w:val="20"/>
+        </w:rPr>
+        <w:t xml:space="preserve">but </w:t>
+      </w:r>
+      <w:r>
+        <w:rPr>
+          <w:sz w:val="20"/>
+        </w:rPr>
+        <w:t xml:space="preserve">requires </w:t>
+      </w:r>
+      <w:r>
+        <w:rPr>
+          <w:b/>
+          <w:color w:val="C05500"/>
+          <w:sz w:val="20"/>
+        </w:rPr>
         <w:t xml:space="preserve">secure </w:t>
       </w:r>
       <w:r>
         <w:rPr>
+          <w:b/>
+          <w:color w:val="C05500"/>
           <w:sz w:val="20"/>
         </w:rPr>
         <w:t xml:space="preserve">key </w:t>
@@ -5006,6 +5044,8 @@
       </w:r>
       <w:r>
         <w:rPr>
+          <w:b/>
+          <w:color w:val="C05500"/>
           <w:sz w:val="20"/>
         </w:rPr>
         <w:t xml:space="preserve">keys: </w:t>
@@ -5024,6 +5064,8 @@
       </w:r>
       <w:r>
         <w:rPr>
+          <w:b/>
+          <w:color w:val="C05500"/>
           <w:sz w:val="20"/>
         </w:rPr>
         <w:t xml:space="preserve">key </w:t>
@@ -5054,6 +5096,8 @@
       </w:r>
       <w:r>
         <w:rPr>
+          <w:b/>
+          <w:color w:val="C05500"/>
           <w:sz w:val="20"/>
         </w:rPr>
         <w:t xml:space="preserve">encrypt, </w:t>
@@ -5078,6 +5122,8 @@
       </w:r>
       <w:r>
         <w:rPr>
+          <w:b/>
+          <w:color w:val="C05500"/>
           <w:sz w:val="20"/>
         </w:rPr>
         <w:t xml:space="preserve">key </w:t>
@@ -5102,6 +5148,8 @@
       </w:r>
       <w:r>
         <w:rPr>
+          <w:b/>
+          <w:color w:val="C05500"/>
           <w:sz w:val="20"/>
         </w:rPr>
         <w:t xml:space="preserve">decrypt. </w:t>
@@ -5200,12 +5248,16 @@
       </w:r>
       <w:r>
         <w:rPr>
+          <w:b/>
+          <w:color w:val="C05500"/>
           <w:sz w:val="20"/>
         </w:rPr>
         <w:t xml:space="preserve">verify </w:t>
       </w:r>
       <w:r>
         <w:rPr>
+          <w:b/>
+          <w:color w:val="C05500"/>
           <w:sz w:val="20"/>
         </w:rPr>
         <w:t xml:space="preserve">integrity </w:t>
@@ -5218,6 +5270,8 @@
       </w:r>
       <w:r>
         <w:rPr>
+          <w:b/>
+          <w:color w:val="C05500"/>
           <w:sz w:val="20"/>
         </w:rPr>
         <w:t xml:space="preserve">any </w:t>
@@ -5292,6 +5346,8 @@
       </w:r>
       <w:r>
         <w:rPr>
+          <w:b/>
+          <w:color w:val="C05500"/>
           <w:sz w:val="20"/>
         </w:rPr>
         <w:t xml:space="preserve">encrypting </w:t>
@@ -5340,6 +5396,8 @@
       </w:r>
       <w:r>
         <w:rPr>
+          <w:b/>
+          <w:color w:val="C05500"/>
           <w:sz w:val="20"/>
         </w:rPr>
         <w:t xml:space="preserve">key; </w:t>
@@ -5364,6 +5422,8 @@
       </w:r>
       <w:r>
         <w:rPr>
+          <w:b/>
+          <w:color w:val="C05500"/>
           <w:sz w:val="20"/>
         </w:rPr>
         <w:t xml:space="preserve">integrity </w:t>
@@ -5432,6 +5492,8 @@
       </w:r>
       <w:r>
         <w:rPr>
+          <w:b/>
+          <w:color w:val="C05500"/>
           <w:sz w:val="20"/>
         </w:rPr>
         <w:t xml:space="preserve">verifies </w:t>
@@ -5462,12 +5524,16 @@
       </w:r>
       <w:r>
         <w:rPr>
+          <w:b/>
+          <w:color w:val="C05500"/>
           <w:sz w:val="20"/>
         </w:rPr>
         <w:t xml:space="preserve">certificates </w:t>
       </w:r>
       <w:r>
         <w:rPr>
+          <w:b/>
+          <w:color w:val="C05500"/>
           <w:sz w:val="20"/>
         </w:rPr>
         <w:t xml:space="preserve">signed </w:t>
@@ -5498,6 +5564,8 @@
       </w:r>
       <w:r>
         <w:rPr>
+          <w:b/>
+          <w:color w:val="C05500"/>
           <w:sz w:val="20"/>
         </w:rPr>
         <w:t xml:space="preserve">key. </w:t>
@@ -5560,6 +5628,8 @@
       </w:r>
       <w:r>
         <w:rPr>
+          <w:b/>
+          <w:color w:val="C05500"/>
           <w:sz w:val="20"/>
         </w:rPr>
         <w:t xml:space="preserve">key </w:t>
@@ -5604,6 +5674,8 @@
       </w:r>
       <w:r>
         <w:rPr>
+          <w:b/>
+          <w:color w:val="C05500"/>
           <w:sz w:val="20"/>
         </w:rPr>
         <w:t xml:space="preserve">signed </w:t>
@@ -5732,6 +5804,8 @@
       </w:r>
       <w:r>
         <w:rPr>
+          <w:b/>
+          <w:color w:val="C05500"/>
           <w:sz w:val="20"/>
         </w:rPr>
         <w:t xml:space="preserve">certificates, </w:t>
@@ -5786,6 +5860,8 @@
       </w:r>
       <w:r>
         <w:rPr>
+          <w:b/>
+          <w:color w:val="C05500"/>
           <w:sz w:val="20"/>
         </w:rPr>
         <w:t xml:space="preserve">key. </w:t>
@@ -5867,6 +5943,8 @@
       </w:r>
       <w:r>
         <w:rPr>
+          <w:b/>
+          <w:color w:val="C05500"/>
           <w:sz w:val="20"/>
         </w:rPr>
         <w:t xml:space="preserve">certificate </w:t>
@@ -5891,6 +5969,8 @@
       </w:r>
       <w:r>
         <w:rPr>
+          <w:b/>
+          <w:color w:val="C05500"/>
           <w:sz w:val="20"/>
         </w:rPr>
         <w:t xml:space="preserve">Key </w:t>
@@ -5921,6 +6001,8 @@
       </w:r>
       <w:r>
         <w:rPr>
+          <w:b/>
+          <w:color w:val="C05500"/>
           <w:sz w:val="20"/>
         </w:rPr>
         <w:t xml:space="preserve">Key </w:t>
@@ -5935,6 +6017,8 @@
       </w:r>
       <w:r>
         <w:rPr>
+          <w:b/>
+          <w:color w:val="C00000"/>
           <w:sz w:val="20"/>
         </w:rPr>
         <w:t xml:space="preserve">disclosed). </w:t>
@@ -6075,6 +6159,8 @@
       </w:r>
       <w:r>
         <w:rPr>
+          <w:b/>
+          <w:color w:val="C05500"/>
           <w:sz w:val="20"/>
         </w:rPr>
         <w:t xml:space="preserve">signature </w:t>
@@ -6093,6 +6179,8 @@
       </w:r>
       <w:r>
         <w:rPr>
+          <w:b/>
+          <w:color w:val="C05500"/>
           <w:sz w:val="20"/>
         </w:rPr>
         <w:t xml:space="preserve">signature. </w:t>
@@ -6446,12 +6534,16 @@
       </w:r>
       <w:r>
         <w:rPr>
+          <w:b/>
+          <w:color w:val="C05500"/>
           <w:sz w:val="20"/>
         </w:rPr>
         <w:t xml:space="preserve">enforce </w:t>
       </w:r>
       <w:r>
         <w:rPr>
+          <w:b/>
+          <w:color w:val="C05500"/>
           <w:sz w:val="20"/>
         </w:rPr>
         <w:t xml:space="preserve">security </w:t>
@@ -6696,6 +6788,8 @@
       </w:r>
       <w:r>
         <w:rPr>
+          <w:b/>
+          <w:color w:val="C05500"/>
           <w:sz w:val="20"/>
         </w:rPr>
         <w:t xml:space="preserve">securing </w:t>
@@ -6720,12 +6814,16 @@
       </w:r>
       <w:r>
         <w:rPr>
+          <w:b/>
+          <w:color w:val="C05500"/>
           <w:sz w:val="20"/>
         </w:rPr>
         <w:t xml:space="preserve">prevent </w:t>
       </w:r>
       <w:r>
         <w:rPr>
+          <w:b/>
+          <w:color w:val="C00000"/>
           <w:sz w:val="20"/>
         </w:rPr>
         <w:t xml:space="preserve">unauthorized </w:t>
@@ -6982,6 +7080,8 @@
       </w:r>
       <w:r>
         <w:rPr>
+          <w:b/>
+          <w:color w:val="C05500"/>
           <w:sz w:val="20"/>
         </w:rPr>
         <w:t xml:space="preserve">detect </w:t>
@@ -6994,6 +7094,8 @@
       </w:r>
       <w:r>
         <w:rPr>
+          <w:b/>
+          <w:color w:val="C05500"/>
           <w:sz w:val="20"/>
         </w:rPr>
         <w:t xml:space="preserve">block. </w:t>
@@ -7295,6 +7397,8 @@
       </w:r>
       <w:r>
         <w:rPr>
+          <w:b/>
+          <w:color w:val="C05500"/>
           <w:sz w:val="20"/>
         </w:rPr>
         <w:t xml:space="preserve">restricted </w:t>
@@ -8131,12 +8235,16 @@
       </w:r>
       <w:r>
         <w:rPr>
+          <w:b/>
+          <w:color w:val="C05500"/>
           <w:sz w:val="20"/>
         </w:rPr>
         <w:t xml:space="preserve">prevent </w:t>
       </w:r>
       <w:r>
         <w:rPr>
+          <w:b/>
+          <w:color w:val="C05500"/>
           <w:sz w:val="20"/>
         </w:rPr>
         <w:t xml:space="preserve">any </w:t>
@@ -8677,6 +8785,8 @@
       </w:pPr>
       <w:r>
         <w:rPr>
+          <w:b/>
+          <w:color w:val="C05500"/>
           <w:sz w:val="20"/>
         </w:rPr>
         <w:t xml:space="preserve">Protection </w:t>
@@ -8689,12 +8799,16 @@
       </w:r>
       <w:r>
         <w:rPr>
+          <w:b/>
+          <w:color w:val="C00000"/>
           <w:sz w:val="20"/>
         </w:rPr>
         <w:t xml:space="preserve">DDoS </w:t>
       </w:r>
       <w:r>
         <w:rPr>
+          <w:b/>
+          <w:color w:val="C00000"/>
           <w:sz w:val="20"/>
         </w:rPr>
         <w:t xml:space="preserve">attacks </w:t>
@@ -9090,6 +9204,8 @@
       </w:r>
       <w:r>
         <w:rPr>
+          <w:b/>
+          <w:color w:val="C05500"/>
           <w:sz w:val="20"/>
         </w:rPr>
         <w:t xml:space="preserve">restricted </w:t>
@@ -9316,6 +9432,8 @@
       </w:r>
       <w:r>
         <w:rPr>
+          <w:b/>
+          <w:color w:val="C05500"/>
           <w:sz w:val="20"/>
         </w:rPr>
         <w:t xml:space="preserve">all </w:t>

</xml_diff>